<commit_message>
modfied the test plan
</commit_message>
<xml_diff>
--- a/API_Test_Plan_ContactList.docx
+++ b/API_Test_Plan_ContactList.docx
@@ -96,7 +96,7 @@
         <w:spacing w:after="120"/>
       </w:pPr>
       <w:r>
-        <w:t>This document outlines the API testing strategy for the Contact List Application. The application exposes a RESTful API that supports full lifecycle management of users and contacts. All testing will be performed manually using Postman, targeting the live hosted environment.</w:t>
+        <w:t>This document outlines the API testing strategy for the Contact List Application. The application exposes a RESTful API that supports full lifecycle management of users and contacts. All testing will be performed using Postman, targeting the live hosted environment.</w:t>
       </w:r>
     </w:p>
     <w:p>
@@ -202,10 +202,7 @@
         <w:pStyle w:val="Heading2"/>
       </w:pPr>
       <w:r>
-        <w:t xml:space="preserve">3.1 </w:t>
-      </w:r>
-      <w:r>
-        <w:t>In Scope</w:t>
+        <w:t>3.1 In Scope</w:t>
       </w:r>
     </w:p>
     <w:p>
@@ -265,10 +262,7 @@
         </w:numPr>
       </w:pPr>
       <w:r>
-        <w:t>Logout</w:t>
-      </w:r>
-      <w:r>
-        <w:t xml:space="preserve"> </w:t>
+        <w:t xml:space="preserve">Logout </w:t>
       </w:r>
     </w:p>
     <w:p>
@@ -376,13 +370,7 @@
         </w:numPr>
       </w:pPr>
       <w:r>
-        <w:t>Authentication</w:t>
-      </w:r>
-      <w:r>
-        <w:t>:</w:t>
-      </w:r>
-      <w:r>
-        <w:t xml:space="preserve"> Bearer token issuance, usage, and invalidation across all protected endpoints</w:t>
+        <w:t>Authentication: Bearer token issuance, usage, and invalidation across all protected endpoints</w:t>
       </w:r>
     </w:p>
     <w:p>
@@ -394,13 +382,7 @@
         </w:numPr>
       </w:pPr>
       <w:r>
-        <w:t>Error Handling</w:t>
-      </w:r>
-      <w:r>
-        <w:t xml:space="preserve">: </w:t>
-      </w:r>
-      <w:r>
-        <w:t>Invalid inputs, missing auth, wrong IDs, duplicate emails</w:t>
+        <w:t>Error Handling: Invalid inputs, missing auth, wrong IDs, duplicate emails</w:t>
       </w:r>
     </w:p>
     <w:p>
@@ -498,7 +480,13 @@
         <w:spacing w:after="120"/>
       </w:pPr>
       <w:r>
-        <w:t>All testing will be performed manually using Postman. Tests will be organized into a Postman Collection with folders per module. Environment variables will be used to manage the base URL and bearer token between requests.</w:t>
+        <w:t>All testing will be performed using Postman. Tests will be organized into a Postman Collection</w:t>
+      </w:r>
+      <w:r>
+        <w:t>, there will be two Collection, for the two modules, and inside them will be folders to manage the test cases</w:t>
+      </w:r>
+      <w:r>
+        <w:t>. Environment variables will be used to manage the base URL and bearer token between requests.</w:t>
       </w:r>
     </w:p>
     <w:p>
@@ -572,7 +560,13 @@
         </w:numPr>
       </w:pPr>
       <w:r>
-        <w:t>Base URL stored as environment variable: {{baseUrl}}</w:t>
+        <w:t>Base URL stored as environment variable: {{</w:t>
+      </w:r>
+      <w:r>
+        <w:t>base_url</w:t>
+      </w:r>
+      <w:r>
+        <w:t>}}</w:t>
       </w:r>
     </w:p>
     <w:p>
@@ -859,21 +853,26 @@
               <w:bottom w:val="single" w:sz="1" w:space="0" w:color="CCCCCC"/>
               <w:right w:val="single" w:sz="1" w:space="0" w:color="CCCCCC"/>
             </w:tcBorders>
-            <w:shd w:val="clear" w:color="auto" w:fill="FFFFFF"/>
-            <w:tcMar>
-              <w:top w:w="80" w:type="dxa"/>
-              <w:left w:w="120" w:type="dxa"/>
-              <w:bottom w:w="80" w:type="dxa"/>
-              <w:right w:w="120" w:type="dxa"/>
-            </w:tcMar>
-          </w:tcPr>
-          <w:p>
-            <w:r>
-              <w:rPr>
-                <w:sz w:val="20"/>
-                <w:szCs w:val="20"/>
-              </w:rPr>
-              <w:t>Postman Collection</w:t>
+            <w:tcMar>
+              <w:top w:w="80" w:type="dxa"/>
+              <w:left w:w="120" w:type="dxa"/>
+              <w:bottom w:w="80" w:type="dxa"/>
+              <w:right w:w="120" w:type="dxa"/>
+            </w:tcMar>
+          </w:tcPr>
+          <w:p>
+            <w:pPr>
+              <w:rPr>
+                <w:sz w:val="20"/>
+                <w:szCs w:val="20"/>
+              </w:rPr>
+            </w:pPr>
+            <w:r>
+              <w:rPr>
+                <w:sz w:val="20"/>
+                <w:szCs w:val="20"/>
+              </w:rPr>
+              <w:t>Test cases</w:t>
             </w:r>
           </w:p>
         </w:tc>
@@ -886,21 +885,26 @@
               <w:bottom w:val="single" w:sz="1" w:space="0" w:color="CCCCCC"/>
               <w:right w:val="single" w:sz="1" w:space="0" w:color="CCCCCC"/>
             </w:tcBorders>
-            <w:shd w:val="clear" w:color="auto" w:fill="FFFFFF"/>
-            <w:tcMar>
-              <w:top w:w="80" w:type="dxa"/>
-              <w:left w:w="120" w:type="dxa"/>
-              <w:bottom w:w="80" w:type="dxa"/>
-              <w:right w:w="120" w:type="dxa"/>
-            </w:tcMar>
-          </w:tcPr>
-          <w:p>
-            <w:r>
-              <w:rPr>
-                <w:sz w:val="20"/>
-                <w:szCs w:val="20"/>
-              </w:rPr>
-              <w:t>Organized collection of all API requests with environment variables</w:t>
+            <w:tcMar>
+              <w:top w:w="80" w:type="dxa"/>
+              <w:left w:w="120" w:type="dxa"/>
+              <w:bottom w:w="80" w:type="dxa"/>
+              <w:right w:w="120" w:type="dxa"/>
+            </w:tcMar>
+          </w:tcPr>
+          <w:p>
+            <w:pPr>
+              <w:rPr>
+                <w:sz w:val="20"/>
+                <w:szCs w:val="20"/>
+              </w:rPr>
+            </w:pPr>
+            <w:r>
+              <w:rPr>
+                <w:sz w:val="20"/>
+                <w:szCs w:val="20"/>
+              </w:rPr>
+              <w:t>Detailed steps, input data, and expected outcomes for verifying specific scenarios</w:t>
             </w:r>
           </w:p>
         </w:tc>
@@ -924,6 +928,81 @@
             </w:tcMar>
           </w:tcPr>
           <w:p>
+            <w:pPr>
+              <w:rPr>
+                <w:sz w:val="20"/>
+                <w:szCs w:val="20"/>
+              </w:rPr>
+            </w:pPr>
+            <w:bookmarkStart w:id="0" w:name="_Hlk227329715"/>
+            <w:r>
+              <w:rPr>
+                <w:sz w:val="20"/>
+                <w:szCs w:val="20"/>
+              </w:rPr>
+              <w:t>Postman Collection</w:t>
+            </w:r>
+          </w:p>
+        </w:tc>
+        <w:tc>
+          <w:tcPr>
+            <w:tcW w:w="6360" w:type="dxa"/>
+            <w:tcBorders>
+              <w:top w:val="single" w:sz="1" w:space="0" w:color="CCCCCC"/>
+              <w:left w:val="single" w:sz="1" w:space="0" w:color="CCCCCC"/>
+              <w:bottom w:val="single" w:sz="1" w:space="0" w:color="CCCCCC"/>
+              <w:right w:val="single" w:sz="1" w:space="0" w:color="CCCCCC"/>
+            </w:tcBorders>
+            <w:shd w:val="clear" w:color="auto" w:fill="F5F8FC"/>
+            <w:tcMar>
+              <w:top w:w="80" w:type="dxa"/>
+              <w:left w:w="120" w:type="dxa"/>
+              <w:bottom w:w="80" w:type="dxa"/>
+              <w:right w:w="120" w:type="dxa"/>
+            </w:tcMar>
+          </w:tcPr>
+          <w:p>
+            <w:pPr>
+              <w:rPr>
+                <w:sz w:val="20"/>
+                <w:szCs w:val="20"/>
+              </w:rPr>
+            </w:pPr>
+            <w:r>
+              <w:rPr>
+                <w:sz w:val="20"/>
+                <w:szCs w:val="20"/>
+              </w:rPr>
+              <w:t>Organized collection of all API requests with environment variables</w:t>
+            </w:r>
+          </w:p>
+        </w:tc>
+      </w:tr>
+      <w:bookmarkEnd w:id="0"/>
+      <w:tr>
+        <w:tc>
+          <w:tcPr>
+            <w:tcW w:w="3000" w:type="dxa"/>
+            <w:tcBorders>
+              <w:top w:val="single" w:sz="1" w:space="0" w:color="CCCCCC"/>
+              <w:left w:val="single" w:sz="1" w:space="0" w:color="CCCCCC"/>
+              <w:bottom w:val="single" w:sz="1" w:space="0" w:color="CCCCCC"/>
+              <w:right w:val="single" w:sz="1" w:space="0" w:color="CCCCCC"/>
+            </w:tcBorders>
+            <w:tcMar>
+              <w:top w:w="80" w:type="dxa"/>
+              <w:left w:w="120" w:type="dxa"/>
+              <w:bottom w:w="80" w:type="dxa"/>
+              <w:right w:w="120" w:type="dxa"/>
+            </w:tcMar>
+          </w:tcPr>
+          <w:p>
+            <w:pPr>
+              <w:rPr>
+                <w:sz w:val="20"/>
+                <w:szCs w:val="20"/>
+              </w:rPr>
+            </w:pPr>
             <w:r>
               <w:rPr>
                 <w:sz w:val="20"/>
@@ -942,15 +1021,20 @@
               <w:bottom w:val="single" w:sz="1" w:space="0" w:color="CCCCCC"/>
               <w:right w:val="single" w:sz="1" w:space="0" w:color="CCCCCC"/>
             </w:tcBorders>
-            <w:shd w:val="clear" w:color="auto" w:fill="F5F8FC"/>
-            <w:tcMar>
-              <w:top w:w="80" w:type="dxa"/>
-              <w:left w:w="120" w:type="dxa"/>
-              <w:bottom w:w="80" w:type="dxa"/>
-              <w:right w:w="120" w:type="dxa"/>
-            </w:tcMar>
-          </w:tcPr>
-          <w:p>
+            <w:tcMar>
+              <w:top w:w="80" w:type="dxa"/>
+              <w:left w:w="120" w:type="dxa"/>
+              <w:bottom w:w="80" w:type="dxa"/>
+              <w:right w:w="120" w:type="dxa"/>
+            </w:tcMar>
+          </w:tcPr>
+          <w:p>
+            <w:pPr>
+              <w:rPr>
+                <w:sz w:val="20"/>
+                <w:szCs w:val="20"/>
+              </w:rPr>
+            </w:pPr>
             <w:r>
               <w:rPr>
                 <w:sz w:val="20"/>
@@ -971,15 +1055,21 @@
               <w:bottom w:val="single" w:sz="1" w:space="0" w:color="CCCCCC"/>
               <w:right w:val="single" w:sz="1" w:space="0" w:color="CCCCCC"/>
             </w:tcBorders>
-            <w:shd w:val="clear" w:color="auto" w:fill="FFFFFF"/>
-            <w:tcMar>
-              <w:top w:w="80" w:type="dxa"/>
-              <w:left w:w="120" w:type="dxa"/>
-              <w:bottom w:w="80" w:type="dxa"/>
-              <w:right w:w="120" w:type="dxa"/>
-            </w:tcMar>
-          </w:tcPr>
-          <w:p>
+            <w:shd w:val="clear" w:color="auto" w:fill="F5F8FC"/>
+            <w:tcMar>
+              <w:top w:w="80" w:type="dxa"/>
+              <w:left w:w="120" w:type="dxa"/>
+              <w:bottom w:w="80" w:type="dxa"/>
+              <w:right w:w="120" w:type="dxa"/>
+            </w:tcMar>
+          </w:tcPr>
+          <w:p>
+            <w:pPr>
+              <w:rPr>
+                <w:sz w:val="20"/>
+                <w:szCs w:val="20"/>
+              </w:rPr>
+            </w:pPr>
             <w:r>
               <w:rPr>
                 <w:sz w:val="20"/>
@@ -998,15 +1088,21 @@
               <w:bottom w:val="single" w:sz="1" w:space="0" w:color="CCCCCC"/>
               <w:right w:val="single" w:sz="1" w:space="0" w:color="CCCCCC"/>
             </w:tcBorders>
-            <w:shd w:val="clear" w:color="auto" w:fill="FFFFFF"/>
-            <w:tcMar>
-              <w:top w:w="80" w:type="dxa"/>
-              <w:left w:w="120" w:type="dxa"/>
-              <w:bottom w:w="80" w:type="dxa"/>
-              <w:right w:w="120" w:type="dxa"/>
-            </w:tcMar>
-          </w:tcPr>
-          <w:p>
+            <w:shd w:val="clear" w:color="auto" w:fill="F5F8FC"/>
+            <w:tcMar>
+              <w:top w:w="80" w:type="dxa"/>
+              <w:left w:w="120" w:type="dxa"/>
+              <w:bottom w:w="80" w:type="dxa"/>
+              <w:right w:w="120" w:type="dxa"/>
+            </w:tcMar>
+          </w:tcPr>
+          <w:p>
+            <w:pPr>
+              <w:rPr>
+                <w:sz w:val="20"/>
+                <w:szCs w:val="20"/>
+              </w:rPr>
+            </w:pPr>
             <w:r>
               <w:rPr>
                 <w:sz w:val="20"/>
@@ -1024,12 +1120,6 @@
       </w:pPr>
     </w:p>
     <w:p>
-      <w:pPr>
-        <w:pStyle w:val="Heading1"/>
-        <w:pBdr>
-          <w:bottom w:val="none" w:sz="0" w:space="0" w:color="auto"/>
-        </w:pBdr>
-      </w:pPr>
       <w:r>
         <w:t>6. Schedule</w:t>
       </w:r>
@@ -1708,7 +1798,7 @@
             </w:tcMar>
           </w:tcPr>
           <w:p>
-            <w:bookmarkStart w:id="0" w:name="_Hlk227091869"/>
+            <w:bookmarkStart w:id="1" w:name="_Hlk227091869"/>
             <w:r>
               <w:rPr>
                 <w:sz w:val="20"/>
@@ -1800,7 +1890,7 @@
           </w:p>
         </w:tc>
       </w:tr>
-      <w:bookmarkEnd w:id="0"/>
+      <w:bookmarkEnd w:id="1"/>
       <w:tr>
         <w:tc>
           <w:tcPr>
@@ -2222,7 +2312,7 @@
                 <w:szCs w:val="20"/>
               </w:rPr>
             </w:pPr>
-            <w:bookmarkStart w:id="1" w:name="_Hlk227092717"/>
+            <w:bookmarkStart w:id="2" w:name="_Hlk227092717"/>
             <w:r>
               <w:rPr>
                 <w:sz w:val="20"/>
@@ -2317,7 +2407,7 @@
           </w:p>
         </w:tc>
       </w:tr>
-      <w:bookmarkEnd w:id="1"/>
+      <w:bookmarkEnd w:id="2"/>
       <w:tr>
         <w:trPr>
           <w:trHeight w:val="679"/>
@@ -5426,6 +5516,7 @@
   <w:style w:type="paragraph" w:default="1" w:styleId="Normal">
     <w:name w:val="Normal"/>
     <w:qFormat/>
+    <w:rsid w:val="003C3153"/>
   </w:style>
   <w:style w:type="paragraph" w:styleId="Heading1">
     <w:name w:val="heading 1"/>
@@ -5522,7 +5613,6 @@
   <w:style w:type="character" w:default="1" w:styleId="DefaultParagraphFont">
     <w:name w:val="Default Paragraph Font"/>
     <w:uiPriority w:val="1"/>
-    <w:semiHidden/>
     <w:unhideWhenUsed/>
   </w:style>
   <w:style w:type="table" w:default="1" w:styleId="TableNormal">
@@ -5694,6 +5784,17 @@
       <w:rFonts w:ascii="Times New Roman" w:eastAsia="Times New Roman" w:hAnsi="Times New Roman" w:cs="Times New Roman"/>
       <w:sz w:val="24"/>
       <w:szCs w:val="24"/>
+    </w:rPr>
+  </w:style>
+  <w:style w:type="character" w:styleId="Strong">
+    <w:name w:val="Strong"/>
+    <w:basedOn w:val="DefaultParagraphFont"/>
+    <w:uiPriority w:val="22"/>
+    <w:qFormat/>
+    <w:rsid w:val="003C3153"/>
+    <w:rPr>
+      <w:b/>
+      <w:bCs/>
     </w:rPr>
   </w:style>
 </w:styles>

</xml_diff>